<commit_message>
Use case spec update, rankings update, removal of some gitkeeps
</commit_message>
<xml_diff>
--- a/1st Deliverable Documents/Use Case Rankings.docx
+++ b/1st Deliverable Documents/Use Case Rankings.docx
@@ -1649,7 +1649,7 @@
               <w:spacing w:after="240"/>
             </w:pPr>
             <w:r>
-              <w:t>Generate Turnover Report</w:t>
+              <w:t xml:space="preserve">Generate Report </w:t>
             </w:r>
           </w:p>
         </w:tc>
@@ -1662,7 +1662,7 @@
               <w:spacing w:after="240"/>
             </w:pPr>
             <w:r>
-              <w:t>Good to have</w:t>
+              <w:t>Essential</w:t>
             </w:r>
           </w:p>
         </w:tc>
@@ -1675,7 +1675,7 @@
               <w:spacing w:after="240"/>
             </w:pPr>
             <w:r>
-              <w:t>Useful for management insight but not required for daily operations (selling/stock/order).</w:t>
+              <w:t>A generalized class that is used for the specialized classes for generating reports.</w:t>
             </w:r>
           </w:p>
         </w:tc>
@@ -1703,7 +1703,7 @@
               <w:spacing w:after="240"/>
             </w:pPr>
             <w:r>
-              <w:t>Generate Stock Availability Report</w:t>
+              <w:t>Optional Printout</w:t>
             </w:r>
           </w:p>
         </w:tc>
@@ -1729,13 +1729,7 @@
               <w:spacing w:after="240"/>
             </w:pPr>
             <w:r>
-              <w:t>Convenient summary for managers</w:t>
-            </w:r>
-            <w:r>
-              <w:t>,</w:t>
-            </w:r>
-            <w:r>
-              <w:t xml:space="preserve"> core stock viewing already exists via other use cases.</w:t>
+              <w:t>After a report is generated, the manager gets the choice to print out said report.</w:t>
             </w:r>
           </w:p>
         </w:tc>
@@ -1750,7 +1744,10 @@
               <w:spacing w:after="240"/>
             </w:pPr>
             <w:r>
-              <w:t>CA-26</w:t>
+              <w:t>CA-2</w:t>
+            </w:r>
+            <w:r>
+              <w:t>6</w:t>
             </w:r>
           </w:p>
         </w:tc>
@@ -1763,7 +1760,7 @@
               <w:spacing w:after="240"/>
             </w:pPr>
             <w:r>
-              <w:t>Generate Account Debt Report</w:t>
+              <w:t>Generate Turnover Report</w:t>
             </w:r>
           </w:p>
         </w:tc>
@@ -1776,7 +1773,7 @@
               <w:spacing w:after="240"/>
             </w:pPr>
             <w:r>
-              <w:t>Important</w:t>
+              <w:t>Good to have</w:t>
             </w:r>
           </w:p>
         </w:tc>
@@ -1789,13 +1786,7 @@
               <w:spacing w:after="240"/>
             </w:pPr>
             <w:r>
-              <w:t>Supports managing overdue accounts at scale</w:t>
-            </w:r>
-            <w:r>
-              <w:t>,</w:t>
-            </w:r>
-            <w:r>
-              <w:t xml:space="preserve"> could be approximated manually from account status/balances.</w:t>
+              <w:t>Useful for management insight but not required for daily operations (selling/stock/order).</w:t>
             </w:r>
           </w:p>
         </w:tc>
@@ -1810,7 +1801,10 @@
               <w:spacing w:after="240"/>
             </w:pPr>
             <w:r>
-              <w:t>CA-27</w:t>
+              <w:t>CA-2</w:t>
+            </w:r>
+            <w:r>
+              <w:t>7</w:t>
             </w:r>
           </w:p>
         </w:tc>
@@ -1823,7 +1817,7 @@
               <w:spacing w:after="240"/>
             </w:pPr>
             <w:r>
-              <w:t>Place Order with IPOS-SA</w:t>
+              <w:t>Generate Stock Availability Report</w:t>
             </w:r>
           </w:p>
         </w:tc>
@@ -1836,7 +1830,7 @@
               <w:spacing w:after="240"/>
             </w:pPr>
             <w:r>
-              <w:t>Essential</w:t>
+              <w:t>Good to have</w:t>
             </w:r>
           </w:p>
         </w:tc>
@@ -1849,17 +1843,13 @@
               <w:spacing w:after="240"/>
             </w:pPr>
             <w:r>
-              <w:t>Required to interact with supplier system for ordering</w:t>
-            </w:r>
-            <w:r>
-              <w:t xml:space="preserve">, </w:t>
-            </w:r>
-            <w:r>
-              <w:t xml:space="preserve">without it the </w:t>
-            </w:r>
-            <w:r>
-              <w:lastRenderedPageBreak/>
-              <w:t>pharmacy cannot replenish from InfoPharma.</w:t>
+              <w:t>Convenient summary for managers</w:t>
+            </w:r>
+            <w:r>
+              <w:t>,</w:t>
+            </w:r>
+            <w:r>
+              <w:t xml:space="preserve"> core stock viewing already exists via other use cases.</w:t>
             </w:r>
           </w:p>
         </w:tc>
@@ -1875,7 +1865,10 @@
             </w:pPr>
             <w:r>
               <w:lastRenderedPageBreak/>
-              <w:t>CA-28</w:t>
+              <w:t>CA-2</w:t>
+            </w:r>
+            <w:r>
+              <w:t>8</w:t>
             </w:r>
           </w:p>
         </w:tc>
@@ -1888,7 +1881,7 @@
               <w:spacing w:after="240"/>
             </w:pPr>
             <w:r>
-              <w:t>Track Order Status</w:t>
+              <w:t>Generate Account Debt Report</w:t>
             </w:r>
           </w:p>
         </w:tc>
@@ -1914,7 +1907,13 @@
               <w:spacing w:after="240"/>
             </w:pPr>
             <w:r>
-              <w:t>Helps manage deliveries and planning, but orders could still be placed without tracking initially.</w:t>
+              <w:t>Supports managing overdue accounts at scale</w:t>
+            </w:r>
+            <w:r>
+              <w:t>,</w:t>
+            </w:r>
+            <w:r>
+              <w:t xml:space="preserve"> could be approximated manually from account status/balances.</w:t>
             </w:r>
           </w:p>
         </w:tc>
@@ -1929,7 +1928,10 @@
               <w:spacing w:after="240"/>
             </w:pPr>
             <w:r>
-              <w:t>CA-29</w:t>
+              <w:t>CA-2</w:t>
+            </w:r>
+            <w:r>
+              <w:t>9</w:t>
             </w:r>
           </w:p>
         </w:tc>
@@ -1942,7 +1944,7 @@
               <w:spacing w:after="240"/>
             </w:pPr>
             <w:r>
-              <w:t>View Previous Orders</w:t>
+              <w:t>Place Order with IPOS-SA</w:t>
             </w:r>
           </w:p>
         </w:tc>
@@ -1955,7 +1957,7 @@
               <w:spacing w:after="240"/>
             </w:pPr>
             <w:r>
-              <w:t>Important</w:t>
+              <w:t>Essential</w:t>
             </w:r>
           </w:p>
         </w:tc>
@@ -1968,13 +1970,21 @@
               <w:spacing w:after="240"/>
             </w:pPr>
             <w:r>
-              <w:t>Useful for reordering and auditing</w:t>
+              <w:t>Required to interact with supplier system for ordering</w:t>
             </w:r>
             <w:r>
               <w:t xml:space="preserve">, </w:t>
             </w:r>
             <w:r>
-              <w:t>not strictly required to place new orders in the short term.</w:t>
+              <w:t xml:space="preserve">without it the pharmacy cannot replenish from </w:t>
+            </w:r>
+            <w:proofErr w:type="spellStart"/>
+            <w:r>
+              <w:t>InfoPharma</w:t>
+            </w:r>
+            <w:proofErr w:type="spellEnd"/>
+            <w:r>
+              <w:t>.</w:t>
             </w:r>
           </w:p>
         </w:tc>
@@ -1989,7 +1999,10 @@
               <w:spacing w:after="240"/>
             </w:pPr>
             <w:r>
-              <w:t>CA-30</w:t>
+              <w:t>CA-</w:t>
+            </w:r>
+            <w:r>
+              <w:t>30</w:t>
             </w:r>
           </w:p>
         </w:tc>
@@ -2002,7 +2015,7 @@
               <w:spacing w:after="240"/>
             </w:pPr>
             <w:r>
-              <w:t>Query Outstanding Balance</w:t>
+              <w:t>Track Order Status</w:t>
             </w:r>
           </w:p>
         </w:tc>
@@ -2015,7 +2028,7 @@
               <w:spacing w:after="240"/>
             </w:pPr>
             <w:r>
-              <w:t>Essential</w:t>
+              <w:t>Important</w:t>
             </w:r>
           </w:p>
         </w:tc>
@@ -2028,7 +2041,7 @@
               <w:spacing w:after="240"/>
             </w:pPr>
             <w:r>
-              <w:t>Staff must know customer debt to enforce credit limits and payment rules before allowing purchases.</w:t>
+              <w:t>Helps manage deliveries and planning, but orders could still be placed without tracking initially.</w:t>
             </w:r>
           </w:p>
         </w:tc>
@@ -2043,7 +2056,10 @@
               <w:spacing w:after="240"/>
             </w:pPr>
             <w:r>
-              <w:t>CA-31</w:t>
+              <w:t>CA-</w:t>
+            </w:r>
+            <w:r>
+              <w:t>31</w:t>
             </w:r>
           </w:p>
         </w:tc>
@@ -2056,7 +2072,7 @@
               <w:spacing w:after="240"/>
             </w:pPr>
             <w:r>
-              <w:t>Set Credit Limit</w:t>
+              <w:t>View Previous Orders</w:t>
             </w:r>
           </w:p>
         </w:tc>
@@ -2069,7 +2085,7 @@
               <w:spacing w:after="240"/>
             </w:pPr>
             <w:r>
-              <w:t>Essential</w:t>
+              <w:t>Important</w:t>
             </w:r>
           </w:p>
         </w:tc>
@@ -2082,7 +2098,13 @@
               <w:spacing w:after="240"/>
             </w:pPr>
             <w:r>
-              <w:t>Credit control is central to account-holder functionality, debt management cannot be enforced without it present.</w:t>
+              <w:t>Useful for reordering and auditing</w:t>
+            </w:r>
+            <w:r>
+              <w:t xml:space="preserve">, </w:t>
+            </w:r>
+            <w:r>
+              <w:t>not strictly required to place new orders in the short term.</w:t>
             </w:r>
           </w:p>
         </w:tc>
@@ -2097,7 +2119,10 @@
               <w:spacing w:after="240"/>
             </w:pPr>
             <w:r>
-              <w:t>CA-32</w:t>
+              <w:t>CA-3</w:t>
+            </w:r>
+            <w:r>
+              <w:t>2</w:t>
             </w:r>
           </w:p>
         </w:tc>
@@ -2110,7 +2135,7 @@
               <w:spacing w:after="240"/>
             </w:pPr>
             <w:r>
-              <w:t>Apply Discount Plan</w:t>
+              <w:t>Query Outstanding Balance</w:t>
             </w:r>
           </w:p>
         </w:tc>
@@ -2123,7 +2148,7 @@
               <w:spacing w:after="240"/>
             </w:pPr>
             <w:r>
-              <w:t>Important</w:t>
+              <w:t>Essential</w:t>
             </w:r>
           </w:p>
         </w:tc>
@@ -2136,7 +2161,7 @@
               <w:spacing w:after="240"/>
             </w:pPr>
             <w:r>
-              <w:t>Discounts are a business feature; system can operate without discounts initially, but value is reduced.</w:t>
+              <w:t>Staff must know customer debt to enforce credit limits and payment rules before allowing purchases.</w:t>
             </w:r>
           </w:p>
         </w:tc>
@@ -2151,7 +2176,10 @@
               <w:spacing w:after="240"/>
             </w:pPr>
             <w:r>
-              <w:t>CA-33</w:t>
+              <w:t>CA-3</w:t>
+            </w:r>
+            <w:r>
+              <w:t>3</w:t>
             </w:r>
           </w:p>
         </w:tc>
@@ -2164,7 +2192,7 @@
               <w:spacing w:after="240"/>
             </w:pPr>
             <w:r>
-              <w:t>Update Reminder Template</w:t>
+              <w:t>Set Credit Limit</w:t>
             </w:r>
           </w:p>
         </w:tc>
@@ -2177,7 +2205,7 @@
               <w:spacing w:after="240"/>
             </w:pPr>
             <w:r>
-              <w:t>Good to have</w:t>
+              <w:t>Essential</w:t>
             </w:r>
           </w:p>
         </w:tc>
@@ -2190,19 +2218,7 @@
               <w:spacing w:after="240"/>
             </w:pPr>
             <w:r>
-              <w:t>Template editing is</w:t>
-            </w:r>
-            <w:r>
-              <w:t xml:space="preserve"> </w:t>
-            </w:r>
-            <w:r>
-              <w:t>convenience/customisation</w:t>
-            </w:r>
-            <w:r>
-              <w:t>. R</w:t>
-            </w:r>
-            <w:r>
-              <w:t>eminders can still be generated using default wording.</w:t>
+              <w:t>Credit control is central to account-holder functionality, debt management cannot be enforced without it present.</w:t>
             </w:r>
           </w:p>
         </w:tc>
@@ -2217,7 +2233,10 @@
               <w:spacing w:after="240"/>
             </w:pPr>
             <w:r>
-              <w:t>CA-34</w:t>
+              <w:t>CA-3</w:t>
+            </w:r>
+            <w:r>
+              <w:t>4</w:t>
             </w:r>
           </w:p>
         </w:tc>
@@ -2230,7 +2249,7 @@
               <w:spacing w:after="240"/>
             </w:pPr>
             <w:r>
-              <w:t>Update Receipt Template</w:t>
+              <w:t>Apply Discount Plan</w:t>
             </w:r>
           </w:p>
         </w:tc>
@@ -2243,7 +2262,7 @@
               <w:spacing w:after="240"/>
             </w:pPr>
             <w:r>
-              <w:t>Good to have</w:t>
+              <w:t>Important</w:t>
             </w:r>
           </w:p>
         </w:tc>
@@ -2256,7 +2275,7 @@
               <w:spacing w:after="240"/>
             </w:pPr>
             <w:r>
-              <w:t>Custom formatting is not essential. Default receipt format is sufficient for operation.</w:t>
+              <w:t>Discounts are a business feature; system can operate without discounts initially, but value is reduced.</w:t>
             </w:r>
           </w:p>
         </w:tc>
@@ -2271,7 +2290,136 @@
               <w:spacing w:after="240"/>
             </w:pPr>
             <w:r>
-              <w:t>CA-35</w:t>
+              <w:t>CA-3</w:t>
+            </w:r>
+            <w:r>
+              <w:t>5</w:t>
+            </w:r>
+          </w:p>
+        </w:tc>
+        <w:tc>
+          <w:tcPr>
+            <w:tcW w:w="2666" w:type="dxa"/>
+          </w:tcPr>
+          <w:p>
+            <w:pPr>
+              <w:spacing w:after="240"/>
+            </w:pPr>
+            <w:r>
+              <w:t>Update Reminder Template</w:t>
+            </w:r>
+          </w:p>
+        </w:tc>
+        <w:tc>
+          <w:tcPr>
+            <w:tcW w:w="1775" w:type="dxa"/>
+          </w:tcPr>
+          <w:p>
+            <w:pPr>
+              <w:spacing w:after="240"/>
+            </w:pPr>
+            <w:r>
+              <w:t>Good to have</w:t>
+            </w:r>
+          </w:p>
+        </w:tc>
+        <w:tc>
+          <w:tcPr>
+            <w:tcW w:w="3342" w:type="dxa"/>
+          </w:tcPr>
+          <w:p>
+            <w:pPr>
+              <w:spacing w:after="240"/>
+            </w:pPr>
+            <w:r>
+              <w:t>Template editing is</w:t>
+            </w:r>
+            <w:r>
+              <w:t xml:space="preserve"> </w:t>
+            </w:r>
+            <w:r>
+              <w:t>convenience/customisation</w:t>
+            </w:r>
+            <w:r>
+              <w:t>. R</w:t>
+            </w:r>
+            <w:r>
+              <w:t>eminders can still be generated using default wording.</w:t>
+            </w:r>
+          </w:p>
+        </w:tc>
+      </w:tr>
+      <w:tr>
+        <w:tc>
+          <w:tcPr>
+            <w:tcW w:w="1233" w:type="dxa"/>
+          </w:tcPr>
+          <w:p>
+            <w:pPr>
+              <w:spacing w:after="240"/>
+            </w:pPr>
+            <w:r>
+              <w:t>CA-3</w:t>
+            </w:r>
+            <w:r>
+              <w:t>6</w:t>
+            </w:r>
+          </w:p>
+        </w:tc>
+        <w:tc>
+          <w:tcPr>
+            <w:tcW w:w="2666" w:type="dxa"/>
+          </w:tcPr>
+          <w:p>
+            <w:pPr>
+              <w:spacing w:after="240"/>
+            </w:pPr>
+            <w:r>
+              <w:t>Update Receipt Template</w:t>
+            </w:r>
+          </w:p>
+        </w:tc>
+        <w:tc>
+          <w:tcPr>
+            <w:tcW w:w="1775" w:type="dxa"/>
+          </w:tcPr>
+          <w:p>
+            <w:pPr>
+              <w:spacing w:after="240"/>
+            </w:pPr>
+            <w:r>
+              <w:t>Good to have</w:t>
+            </w:r>
+          </w:p>
+        </w:tc>
+        <w:tc>
+          <w:tcPr>
+            <w:tcW w:w="3342" w:type="dxa"/>
+          </w:tcPr>
+          <w:p>
+            <w:pPr>
+              <w:spacing w:after="240"/>
+            </w:pPr>
+            <w:r>
+              <w:t>Custom formatting is not essential. Default receipt format is sufficient for operation.</w:t>
+            </w:r>
+          </w:p>
+        </w:tc>
+      </w:tr>
+      <w:tr>
+        <w:tc>
+          <w:tcPr>
+            <w:tcW w:w="1233" w:type="dxa"/>
+          </w:tcPr>
+          <w:p>
+            <w:pPr>
+              <w:spacing w:after="240"/>
+            </w:pPr>
+            <w:r>
+              <w:t>CA-3</w:t>
+            </w:r>
+            <w:r>
+              <w:t>7</w:t>
             </w:r>
           </w:p>
         </w:tc>

</xml_diff>